<commit_message>
Set August commitment to undecided and clear reflection section
</commit_message>
<xml_diff>
--- a/日報_2026-08-03.docx
+++ b/日報_2026-08-03.docx
@@ -153,27 +153,7 @@
           <w:sz w:val="21"/>
           <w:szCs w:val="21"/>
         </w:rPr>
-        <w:t xml:space="preserve">・インストレベルを8.1pt上昇</w:t>
-      </w:r>
-    </w:p>
-    <w:p>
-      <w:r>
-        <w:rPr>
-          <w:rFonts w:ascii="Yu Gothic" w:cs="Yu Gothic" w:eastAsia="Yu Gothic" w:hAnsi="Yu Gothic"/>
-          <w:sz w:val="21"/>
-          <w:szCs w:val="21"/>
-        </w:rPr>
-        <w:t xml:space="preserve">・研修失敗率8％以下</w:t>
-      </w:r>
-    </w:p>
-    <w:p>
-      <w:r>
-        <w:rPr>
-          <w:rFonts w:ascii="Yu Gothic" w:cs="Yu Gothic" w:eastAsia="Yu Gothic" w:hAnsi="Yu Gothic"/>
-          <w:sz w:val="21"/>
-          <w:szCs w:val="21"/>
-        </w:rPr>
-        <w:t xml:space="preserve">・研修報告書10件作成</w:t>
+        <w:t xml:space="preserve">未決定</w:t>
       </w:r>
     </w:p>
     <w:p/>
@@ -187,80 +167,7 @@
         <w:t xml:space="preserve">■コミットメント進捗・所感</w:t>
       </w:r>
     </w:p>
-    <w:p>
-      <w:r>
-        <w:rPr>
-          <w:rFonts w:ascii="Yu Gothic" w:cs="Yu Gothic" w:eastAsia="Yu Gothic" w:hAnsi="Yu Gothic"/>
-          <w:sz w:val="21"/>
-          <w:szCs w:val="21"/>
-        </w:rPr>
-        <w:t xml:space="preserve">本日はインストラクター室のチャレンジマネージャーとして改めて配属いただきましたので、そのための引継ぎ、整理を行っておりました。</w:t>
-      </w:r>
-    </w:p>
-    <w:p>
-      <w:r>
-        <w:rPr>
-          <w:rFonts w:ascii="Yu Gothic" w:cs="Yu Gothic" w:eastAsia="Yu Gothic" w:hAnsi="Yu Gothic"/>
-          <w:sz w:val="21"/>
-          <w:szCs w:val="21"/>
-        </w:rPr>
-        <w:t xml:space="preserve">「人を動かすコミュニケーション」は私の中での課題点でございますので、今回いただいたチャンスを活かして未来会議で宣言をした「憧れられるインストラクター」を作ってまいります。2年前失敗をしておりますので、その時の状況も振り返りながらインスト室メンバーを富ませるための動きをしてまりいます。</w:t>
-      </w:r>
-    </w:p>
     <w:p/>
-    <w:p>
-      <w:r>
-        <w:rPr>
-          <w:rFonts w:ascii="Yu Gothic" w:cs="Yu Gothic" w:eastAsia="Yu Gothic" w:hAnsi="Yu Gothic"/>
-          <w:sz w:val="21"/>
-          <w:szCs w:val="21"/>
-        </w:rPr>
-        <w:t xml:space="preserve">本日は中村さんの配属のための役割定義作成、太平のカリキュラム開発課でのタスク引継ぎ、それ以外には現在の評価制度が上手くいっていない部分を稲葉さんから引継ぎ受けましたのでそちらの検討を進めておりました。</w:t>
-      </w:r>
-    </w:p>
-    <w:p/>
-    <w:p>
-      <w:r>
-        <w:rPr>
-          <w:rFonts w:ascii="Yu Gothic" w:cs="Yu Gothic" w:eastAsia="Yu Gothic" w:hAnsi="Yu Gothic"/>
-          <w:sz w:val="21"/>
-          <w:szCs w:val="21"/>
-        </w:rPr>
-        <w:t xml:space="preserve">中村さんの3Q役割定義については作成済、露木さんにもOKをいただいたのでジョンさんの確認後西社長まで提案をいたします。8月中にさっそく3日程の研修登壇を行っていただく予定です。また、太平のカリキュラム開発課時代のタスクについても太平ディレクションの元作成をしていく予定です。</w:t>
-      </w:r>
-    </w:p>
-    <w:p/>
-    <w:p>
-      <w:r>
-        <w:rPr>
-          <w:rFonts w:ascii="Yu Gothic" w:cs="Yu Gothic" w:eastAsia="Yu Gothic" w:hAnsi="Yu Gothic"/>
-          <w:sz w:val="21"/>
-          <w:szCs w:val="21"/>
-        </w:rPr>
-        <w:t xml:space="preserve">現在の評価制度が上手くいっていない部分については、「インストレベル」と「ディレクター成績」の対照が取れていないこと、PIディレクションに入らないとどちらもポイントが上がっていかないことが問題であると認識をいたしました。</w:t>
-      </w:r>
-    </w:p>
-    <w:p>
-      <w:r>
-        <w:rPr>
-          <w:rFonts w:ascii="Yu Gothic" w:cs="Yu Gothic" w:eastAsia="Yu Gothic" w:hAnsi="Yu Gothic"/>
-          <w:sz w:val="21"/>
-          <w:szCs w:val="21"/>
-        </w:rPr>
-        <w:t xml:space="preserve">コンセプト設計から各それぞれの評価指標を策定していきます。例えば、インストレベルであれば自信の授業のレベルを測るもの、と定義をしてPIディレクションは外すとしたいと考えております。同様にディレクター成績についても「自身で価値提供をすること」と「PIをディレクションして価値提供をすること」を同じ評価にするために重みづけをしたりしながら、ディレクター課に所属をしているとポイント数が高く出て、インストレベル課に所属していると実情よりもポイント数が低く出てしまうことを無くしてまいります。</w:t>
-      </w:r>
-    </w:p>
-    <w:p/>
-    <w:p>
-      <w:r>
-        <w:rPr>
-          <w:rFonts w:ascii="Yu Gothic" w:cs="Yu Gothic" w:eastAsia="Yu Gothic" w:hAnsi="Yu Gothic"/>
-          <w:sz w:val="21"/>
-          <w:szCs w:val="21"/>
-        </w:rPr>
-        <w:t xml:space="preserve">改めて整っていない部分の設計、インストラクター室を大きくしていくための動きをチャレンジマネージャーとして取ってまいります。</w:t>
-      </w:r>
-    </w:p>
     <w:p>
       <w:r>
         <w:rPr>

</xml_diff>

<commit_message>
Replace August commitment items and keep reflection section empty
</commit_message>
<xml_diff>
--- a/日報_2026-08-03.docx
+++ b/日報_2026-08-03.docx
@@ -143,17 +143,47 @@
           <w:sz w:val="21"/>
           <w:szCs w:val="21"/>
         </w:rPr>
-        <w:t xml:space="preserve">■8月コミットメント</w:t>
-      </w:r>
-    </w:p>
-    <w:p>
-      <w:r>
-        <w:rPr>
-          <w:rFonts w:ascii="Yu Gothic" w:cs="Yu Gothic" w:eastAsia="Yu Gothic" w:hAnsi="Yu Gothic"/>
-          <w:sz w:val="21"/>
-          <w:szCs w:val="21"/>
-        </w:rPr>
-        <w:t xml:space="preserve">未決定</w:t>
+        <w:t xml:space="preserve">■8月コミットメント（未決定）</w:t>
+      </w:r>
+    </w:p>
+    <w:p>
+      <w:r>
+        <w:rPr>
+          <w:rFonts w:ascii="Yu Gothic" w:cs="Yu Gothic" w:eastAsia="Yu Gothic" w:hAnsi="Yu Gothic"/>
+          <w:sz w:val="21"/>
+          <w:szCs w:val="21"/>
+        </w:rPr>
+        <w:t xml:space="preserve">・AIエージェント系の講座(AIエージェント講座、Claude Cowork講座、Claude Code講座)8コマの開発</w:t>
+      </w:r>
+    </w:p>
+    <w:p>
+      <w:r>
+        <w:rPr>
+          <w:rFonts w:ascii="Yu Gothic" w:cs="Yu Gothic" w:eastAsia="Yu Gothic" w:hAnsi="Yu Gothic"/>
+          <w:sz w:val="21"/>
+          <w:szCs w:val="21"/>
+        </w:rPr>
+        <w:t xml:space="preserve">・受講生採用を継続的に回していく仕組みの型化(スプシ作成)　</w:t>
+      </w:r>
+    </w:p>
+    <w:p>
+      <w:r>
+        <w:rPr>
+          <w:rFonts w:ascii="Yu Gothic" w:cs="Yu Gothic" w:eastAsia="Yu Gothic" w:hAnsi="Yu Gothic"/>
+          <w:sz w:val="21"/>
+          <w:szCs w:val="21"/>
+        </w:rPr>
+        <w:t xml:space="preserve">・法人研修の平均授業評価平均4.30以上</w:t>
+      </w:r>
+    </w:p>
+    <w:p>
+      <w:r>
+        <w:rPr>
+          <w:rFonts w:ascii="Yu Gothic" w:cs="Yu Gothic" w:eastAsia="Yu Gothic" w:hAnsi="Yu Gothic"/>
+          <w:sz w:val="21"/>
+          <w:szCs w:val="21"/>
+        </w:rPr>
+        <w:t xml:space="preserve">・既存講座の演習カリキュラム開発（93h）以上</w:t>
       </w:r>
     </w:p>
     <w:p/>

</xml_diff>

<commit_message>
Revise reflection: remove overstepping phrase, add learning from team
</commit_message>
<xml_diff>
--- a/日報_2026-08-03.docx
+++ b/日報_2026-08-03.docx
@@ -175,7 +175,18 @@
           <w:sz w:val="21"/>
           <w:szCs w:val="21"/>
         </w:rPr>
-        <w:t xml:space="preserve">初日にあたり、改めて「当たり前のことを、当たり前にやり切る」を自分の軸に置きます。そのうえで半年後・1年後に求められる状態から逆算し、必要とされることを一日でも早く達成してまいります。望む状態を1日でも前倒しで届けるたびに、周りに生まれる感動は増えていく——それが自分の原動力です。立ち上げ期のチームですが、皆さまと共に前へ進んでまいりますので、どうぞよろしくお願いいたします。</w:t>
+        <w:t xml:space="preserve">初日にあたり、改めて「当たり前のことを、当たり前にやり切る」を自分の軸に置きます。そのうえで半年後・1年後に求められる状態から逆算し、必要とされることを一日でも早く達成してまいります。望む状態を1日でも前倒しで届けるたびに、周りに生まれる感動は増えていく——それが自分の原動力です。皆さまと共に前へ進んでまいりますので、どうぞよろしくお願いいたします。</w:t>
+      </w:r>
+    </w:p>
+    <w:p/>
+    <w:p>
+      <w:r>
+        <w:rPr>
+          <w:rFonts w:ascii="Yu Gothic" w:cs="Yu Gothic" w:eastAsia="Yu Gothic" w:hAnsi="Yu Gothic"/>
+          <w:sz w:val="21"/>
+          <w:szCs w:val="21"/>
+        </w:rPr>
+        <w:t xml:space="preserve">今月中に研修へ登壇する可能性が高いため、太平さん・谷川さん・青隆さんに研修準備の進め方を都度伺いながら準備を進めてまいります。本日はさっそく青隆さんより、インストレベルの計算シート・研修管理シート・インストレベル管理表などを共有いただきました。今後は自分から積極的に質問し、優秀な方に伺うことが最短だと考えておりますので、皆さまの知見をいち早く吸収してまいります。</w:t>
       </w:r>
     </w:p>
     <w:p/>

</xml_diff>

<commit_message>
Enrich reflection with today's activities and set self-score to 60
</commit_message>
<xml_diff>
--- a/日報_2026-08-03.docx
+++ b/日報_2026-08-03.docx
@@ -30,7 +30,7 @@
           <w:sz w:val="21"/>
           <w:szCs w:val="21"/>
         </w:rPr>
-        <w:t xml:space="preserve">法人インストラクター室 異動初日 ―当たり前を、当たり前に―　【点数】点</w:t>
+        <w:t xml:space="preserve">法人インストラクター室 異動初日 ―当たり前を、当たり前に―　60点</w:t>
       </w:r>
     </w:p>
     <w:p/>
@@ -164,7 +164,7 @@
           <w:sz w:val="21"/>
           <w:szCs w:val="21"/>
         </w:rPr>
-        <w:t xml:space="preserve">本日より法人インストラクター室 インストレベルチームへ異動し、初日を迎えました。まずは法人インストラクターとしての業務全体像を掴むため、法人インストのConfluence（業務マニュアル）を確認し、日々の業務イメージを持つことができました。</w:t>
+        <w:t xml:space="preserve">本日より法人インストラクター室 インストレベルチームへ異動し、初日を迎えました。本日は露木さんより役割定義、青隆さんよりインストレベルのレクチャーをいただき、あわせてインスト業務のSKILL化・Confluence（業務マニュアル）の確認を通じて、法人インストラクターとしての役割と評価の基準、日々の業務フローの全体像を掴むことができました。</w:t>
       </w:r>
     </w:p>
     <w:p/>
@@ -186,7 +186,7 @@
           <w:sz w:val="21"/>
           <w:szCs w:val="21"/>
         </w:rPr>
-        <w:t xml:space="preserve">今月中に研修へ登壇する可能性が高いため、太平さん・谷川さん・青隆さんに研修準備の進め方を都度伺いながら準備を進めてまいります。本日はさっそく青隆さんより、インストレベルの計算シート・研修管理シート・インストレベル管理表などを共有いただきました。今後は自分から積極的に質問し、優秀な方に伺うことが最短だと考えておりますので、皆さまの知見をいち早く吸収してまいります。</w:t>
+        <w:t xml:space="preserve">今月中に研修へ登壇する可能性が高いため、本日は太平さんとの1on1で今後の方針をすり合わせつつ、生成AI活用講座の授業準備にも着手しました。研修準備の進め方は太平さん・谷川さん・青隆さんに都度伺いながら進めてまいります。本日はさっそく青隆さんより、インストレベルの計算シート・研修管理シート・インストレベル管理表などを共有いただきました。今後は自分から積極的に質問し、優秀な方に伺うことが最短だと考えておりますので、皆さまの知見をいち早く吸収してまいります。</w:t>
       </w:r>
     </w:p>
     <w:p/>

</xml_diff>

<commit_message>
Add motto, set all sales figures to zero, self-score 65
</commit_message>
<xml_diff>
--- a/日報_2026-08-03.docx
+++ b/日報_2026-08-03.docx
@@ -30,7 +30,7 @@
           <w:sz w:val="21"/>
           <w:szCs w:val="21"/>
         </w:rPr>
-        <w:t xml:space="preserve">法人インストラクター室 異動初日 ―当たり前を、当たり前に―　60点</w:t>
+        <w:t xml:space="preserve">法人インストラクター室 異動初日 ―当たり前を、当たり前に―　65点</w:t>
       </w:r>
     </w:p>
     <w:p/>
@@ -51,27 +51,27 @@
           <w:sz w:val="21"/>
           <w:szCs w:val="21"/>
         </w:rPr>
-        <w:t xml:space="preserve">全体：\0 / \【目標】（達成率：0%）</w:t>
-      </w:r>
-    </w:p>
-    <w:p>
-      <w:r>
-        <w:rPr>
-          <w:rFonts w:ascii="Yu Gothic" w:cs="Yu Gothic" w:eastAsia="Yu Gothic" w:hAnsi="Yu Gothic"/>
-          <w:sz w:val="21"/>
-          <w:szCs w:val="21"/>
-        </w:rPr>
-        <w:t xml:space="preserve">法人：\0 / \【目標】（達成率：0%）</w:t>
-      </w:r>
-    </w:p>
-    <w:p>
-      <w:r>
-        <w:rPr>
-          <w:rFonts w:ascii="Yu Gothic" w:cs="Yu Gothic" w:eastAsia="Yu Gothic" w:hAnsi="Yu Gothic"/>
-          <w:sz w:val="21"/>
-          <w:szCs w:val="21"/>
-        </w:rPr>
-        <w:t xml:space="preserve">個人：\0 / \【目標】（達成率：0%）</w:t>
+        <w:t xml:space="preserve">全体：\0 / \0（達成率：0%）</w:t>
+      </w:r>
+    </w:p>
+    <w:p>
+      <w:r>
+        <w:rPr>
+          <w:rFonts w:ascii="Yu Gothic" w:cs="Yu Gothic" w:eastAsia="Yu Gothic" w:hAnsi="Yu Gothic"/>
+          <w:sz w:val="21"/>
+          <w:szCs w:val="21"/>
+        </w:rPr>
+        <w:t xml:space="preserve">法人：\0 / \0（達成率：0%）</w:t>
+      </w:r>
+    </w:p>
+    <w:p>
+      <w:r>
+        <w:rPr>
+          <w:rFonts w:ascii="Yu Gothic" w:cs="Yu Gothic" w:eastAsia="Yu Gothic" w:hAnsi="Yu Gothic"/>
+          <w:sz w:val="21"/>
+          <w:szCs w:val="21"/>
+        </w:rPr>
+        <w:t xml:space="preserve">個人：\0 / \0（達成率：0%）</w:t>
       </w:r>
     </w:p>
     <w:p/>
@@ -186,7 +186,7 @@
           <w:sz w:val="21"/>
           <w:szCs w:val="21"/>
         </w:rPr>
-        <w:t xml:space="preserve">今月中に研修へ登壇する可能性が高いため、本日は太平さんとの1on1で今後の方針をすり合わせつつ、生成AI活用講座の授業準備にも着手しました。研修準備の進め方は太平さん・谷川さん・青隆さんに都度伺いながら進めてまいります。本日はさっそく青隆さんより、インストレベルの計算シート・研修管理シート・インストレベル管理表などを共有いただきました。今後は自分から積極的に質問し、優秀な方に伺うことが最短だと考えておりますので、皆さまの知見をいち早く吸収してまいります。</w:t>
+        <w:t xml:space="preserve">今月中に研修へ登壇する可能性が高いため、本日は太平さんとの1on1で今後の方針をすり合わせつつ、生成AI活用講座の授業準備にも着手しました。研修準備の進め方は太平さん・谷川さん・青隆さんに都度伺いながら進めてまいります。本日はさっそく青隆さんより、インストレベルの計算シート・研修管理シート・インストレベル管理表などを共有いただきました。「我以外皆我師」を座右の銘に、周りの優秀な皆さまお一人おひとりを師と捉え、自分から積極的に質問し、その知見をいち早く吸収してまいります。</w:t>
       </w:r>
     </w:p>
     <w:p/>

</xml_diff>